<commit_message>
fixing the last of it
</commit_message>
<xml_diff>
--- a/docs/lectures/lecture_16/16_lecture_powerpoint.docx
+++ b/docs/lectures/lecture_16/16_lecture_powerpoint.docx
@@ -18393,7 +18393,7 @@
         <w:rPr>
           <w:rStyle w:val="DocumentationTok"/>
         </w:rPr>
-        <w:t xml:space="preserve">## Model     1   32.602 0.10636 5.7128  0.005 **</w:t>
+        <w:t xml:space="preserve">## Model     1   32.602 0.10636 5.7128  0.002 **</w:t>
       </w:r>
       <w:r>
         <w:br/>
@@ -18456,6 +18456,78 @@
         <w:rPr>
           <w:rStyle w:val="DocumentationTok"/>
         </w:rPr>
+        <w:t xml:space="preserve">##          Df SumOfSqs      R2      F Pr(&gt;F)   </w:t>
+      </w:r>
+      <w:r>
+        <w:br/>
+      </w:r>
+      <w:r>
+        <w:rPr>
+          <w:rStyle w:val="DocumentationTok"/>
+        </w:rPr>
+        <w:t xml:space="preserve">## Model     1    47.72 0.10517 5.6414  0.003 **</w:t>
+      </w:r>
+      <w:r>
+        <w:br/>
+      </w:r>
+      <w:r>
+        <w:rPr>
+          <w:rStyle w:val="DocumentationTok"/>
+        </w:rPr>
+        <w:t xml:space="preserve">## Residual 48   406.06 0.89483                 </w:t>
+      </w:r>
+      <w:r>
+        <w:br/>
+      </w:r>
+      <w:r>
+        <w:rPr>
+          <w:rStyle w:val="DocumentationTok"/>
+        </w:rPr>
+        <w:t xml:space="preserve">## Total    49   453.78 1.00000                 </w:t>
+      </w:r>
+      <w:r>
+        <w:br/>
+      </w:r>
+      <w:r>
+        <w:rPr>
+          <w:rStyle w:val="DocumentationTok"/>
+        </w:rPr>
+        <w:t xml:space="preserve">## ---</w:t>
+      </w:r>
+      <w:r>
+        <w:br/>
+      </w:r>
+      <w:r>
+        <w:rPr>
+          <w:rStyle w:val="DocumentationTok"/>
+        </w:rPr>
+        <w:t xml:space="preserve">## Signif. codes:  0 '***' 0.001 '**' 0.01 '*' 0.05 '.' 0.1 ' ' 1</w:t>
+      </w:r>
+      <w:r>
+        <w:br/>
+      </w:r>
+      <w:r>
+        <w:rPr>
+          <w:rStyle w:val="DocumentationTok"/>
+        </w:rPr>
+        <w:t xml:space="preserve">## </w:t>
+      </w:r>
+      <w:r>
+        <w:br/>
+      </w:r>
+      <w:r>
+        <w:rPr>
+          <w:rStyle w:val="DocumentationTok"/>
+        </w:rPr>
+        <w:t xml:space="preserve">## $TJH_vs_HD</w:t>
+      </w:r>
+      <w:r>
+        <w:br/>
+      </w:r>
+      <w:r>
+        <w:rPr>
+          <w:rStyle w:val="DocumentationTok"/>
+        </w:rPr>
         <w:t xml:space="preserve">##          Df SumOfSqs      R2      F Pr(&gt;F)    </w:t>
       </w:r>
       <w:r>
@@ -18465,7 +18537,7 @@
         <w:rPr>
           <w:rStyle w:val="DocumentationTok"/>
         </w:rPr>
-        <w:t xml:space="preserve">## Model     1    47.72 0.10517 5.6414  0.001 ***</w:t>
+        <w:t xml:space="preserve">## Model     1   69.308 0.25135 11.751  0.001 ***</w:t>
       </w:r>
       <w:r>
         <w:br/>
@@ -18474,7 +18546,7 @@
         <w:rPr>
           <w:rStyle w:val="DocumentationTok"/>
         </w:rPr>
-        <w:t xml:space="preserve">## Residual 48   406.06 0.89483                  </w:t>
+        <w:t xml:space="preserve">## Residual 35  206.432 0.74865                  </w:t>
       </w:r>
       <w:r>
         <w:br/>
@@ -18483,7 +18555,7 @@
         <w:rPr>
           <w:rStyle w:val="DocumentationTok"/>
         </w:rPr>
-        <w:t xml:space="preserve">## Total    49   453.78 1.00000                  </w:t>
+        <w:t xml:space="preserve">## Total    36  275.740 1.00000                  </w:t>
       </w:r>
       <w:r>
         <w:br/>
@@ -18519,7 +18591,7 @@
         <w:rPr>
           <w:rStyle w:val="DocumentationTok"/>
         </w:rPr>
-        <w:t xml:space="preserve">## $TJH_vs_HD</w:t>
+        <w:t xml:space="preserve">## $DG_vs_LEH</w:t>
       </w:r>
       <w:r>
         <w:br/>
@@ -18528,6 +18600,78 @@
         <w:rPr>
           <w:rStyle w:val="DocumentationTok"/>
         </w:rPr>
+        <w:t xml:space="preserve">##          Df SumOfSqs      R2      F Pr(&gt;F)  </w:t>
+      </w:r>
+      <w:r>
+        <w:br/>
+      </w:r>
+      <w:r>
+        <w:rPr>
+          <w:rStyle w:val="DocumentationTok"/>
+        </w:rPr>
+        <w:t xml:space="preserve">## Model     1    26.24 0.06493 3.3333   0.03 *</w:t>
+      </w:r>
+      <w:r>
+        <w:br/>
+      </w:r>
+      <w:r>
+        <w:rPr>
+          <w:rStyle w:val="DocumentationTok"/>
+        </w:rPr>
+        <w:t xml:space="preserve">## Residual 48   377.85 0.93507                </w:t>
+      </w:r>
+      <w:r>
+        <w:br/>
+      </w:r>
+      <w:r>
+        <w:rPr>
+          <w:rStyle w:val="DocumentationTok"/>
+        </w:rPr>
+        <w:t xml:space="preserve">## Total    49   404.09 1.00000                </w:t>
+      </w:r>
+      <w:r>
+        <w:br/>
+      </w:r>
+      <w:r>
+        <w:rPr>
+          <w:rStyle w:val="DocumentationTok"/>
+        </w:rPr>
+        <w:t xml:space="preserve">## ---</w:t>
+      </w:r>
+      <w:r>
+        <w:br/>
+      </w:r>
+      <w:r>
+        <w:rPr>
+          <w:rStyle w:val="DocumentationTok"/>
+        </w:rPr>
+        <w:t xml:space="preserve">## Signif. codes:  0 '***' 0.001 '**' 0.01 '*' 0.05 '.' 0.1 ' ' 1</w:t>
+      </w:r>
+      <w:r>
+        <w:br/>
+      </w:r>
+      <w:r>
+        <w:rPr>
+          <w:rStyle w:val="DocumentationTok"/>
+        </w:rPr>
+        <w:t xml:space="preserve">## </w:t>
+      </w:r>
+      <w:r>
+        <w:br/>
+      </w:r>
+      <w:r>
+        <w:rPr>
+          <w:rStyle w:val="DocumentationTok"/>
+        </w:rPr>
+        <w:t xml:space="preserve">## $DG_vs_HD</w:t>
+      </w:r>
+      <w:r>
+        <w:br/>
+      </w:r>
+      <w:r>
+        <w:rPr>
+          <w:rStyle w:val="DocumentationTok"/>
+        </w:rPr>
         <w:t xml:space="preserve">##          Df SumOfSqs      R2      F Pr(&gt;F)    </w:t>
       </w:r>
       <w:r>
@@ -18537,7 +18681,7 @@
         <w:rPr>
           <w:rStyle w:val="DocumentationTok"/>
         </w:rPr>
-        <w:t xml:space="preserve">## Model     1   69.308 0.25135 11.751  0.001 ***</w:t>
+        <w:t xml:space="preserve">## Model     1   131.09 0.42382 25.745  0.001 ***</w:t>
       </w:r>
       <w:r>
         <w:br/>
@@ -18546,7 +18690,7 @@
         <w:rPr>
           <w:rStyle w:val="DocumentationTok"/>
         </w:rPr>
-        <w:t xml:space="preserve">## Residual 35  206.432 0.74865                  </w:t>
+        <w:t xml:space="preserve">## Residual 35   178.22 0.57618                  </w:t>
       </w:r>
       <w:r>
         <w:br/>
@@ -18555,7 +18699,7 @@
         <w:rPr>
           <w:rStyle w:val="DocumentationTok"/>
         </w:rPr>
-        <w:t xml:space="preserve">## Total    36  275.740 1.00000                  </w:t>
+        <w:t xml:space="preserve">## Total    36   309.31 1.00000                  </w:t>
       </w:r>
       <w:r>
         <w:br/>
@@ -18591,7 +18735,7 @@
         <w:rPr>
           <w:rStyle w:val="DocumentationTok"/>
         </w:rPr>
-        <w:t xml:space="preserve">## $DG_vs_LEH</w:t>
+        <w:t xml:space="preserve">## $LEH_vs_HD</w:t>
       </w:r>
       <w:r>
         <w:br/>
@@ -18600,7 +18744,7 @@
         <w:rPr>
           <w:rStyle w:val="DocumentationTok"/>
         </w:rPr>
-        <w:t xml:space="preserve">##          Df SumOfSqs      R2      F Pr(&gt;F)  </w:t>
+        <w:t xml:space="preserve">##          Df SumOfSqs     R2      F Pr(&gt;F)    </w:t>
       </w:r>
       <w:r>
         <w:br/>
@@ -18609,7 +18753,7 @@
         <w:rPr>
           <w:rStyle w:val="DocumentationTok"/>
         </w:rPr>
-        <w:t xml:space="preserve">## Model     1    26.24 0.06493 3.3333   0.02 *</w:t>
+        <w:t xml:space="preserve">## Model     1   101.69 0.2468 11.468  0.001 ***</w:t>
       </w:r>
       <w:r>
         <w:br/>
@@ -18618,7 +18762,7 @@
         <w:rPr>
           <w:rStyle w:val="DocumentationTok"/>
         </w:rPr>
-        <w:t xml:space="preserve">## Residual 48   377.85 0.93507                </w:t>
+        <w:t xml:space="preserve">## Residual 35   310.35 0.7532                  </w:t>
       </w:r>
       <w:r>
         <w:br/>
@@ -18627,7 +18771,7 @@
         <w:rPr>
           <w:rStyle w:val="DocumentationTok"/>
         </w:rPr>
-        <w:t xml:space="preserve">## Total    49   404.09 1.00000                </w:t>
+        <w:t xml:space="preserve">## Total    36   412.04 1.0000                  </w:t>
       </w:r>
       <w:r>
         <w:br/>
@@ -18663,7 +18807,7 @@
         <w:rPr>
           <w:rStyle w:val="DocumentationTok"/>
         </w:rPr>
-        <w:t xml:space="preserve">## $DG_vs_HD</w:t>
+        <w:t xml:space="preserve">## attr(,"class")</w:t>
       </w:r>
       <w:r>
         <w:br/>
@@ -18672,7 +18816,216 @@
         <w:rPr>
           <w:rStyle w:val="DocumentationTok"/>
         </w:rPr>
-        <w:t xml:space="preserve">##          Df SumOfSqs      R2      F Pr(&gt;F)    </w:t>
+        <w:t xml:space="preserve">## [1] "pwadstrata" "list"</w:t>
+      </w:r>
+    </w:p>
+    <w:p>
+      <w:pPr>
+        <w:pStyle w:val="SourceCode"/>
+      </w:pPr>
+      <w:r>
+        <w:rPr>
+          <w:rStyle w:val="CommentTok"/>
+        </w:rPr>
+        <w:t xml:space="preserve"># install.packages("RVAideMemoire")</w:t>
+      </w:r>
+      <w:r>
+        <w:br/>
+      </w:r>
+      <w:r>
+        <w:rPr>
+          <w:rStyle w:val="FunctionTok"/>
+        </w:rPr>
+        <w:t xml:space="preserve">library</w:t>
+      </w:r>
+      <w:r>
+        <w:rPr>
+          <w:rStyle w:val="NormalTok"/>
+        </w:rPr>
+        <w:t xml:space="preserve">(RVAideMemoire)</w:t>
+      </w:r>
+      <w:r>
+        <w:br/>
+      </w:r>
+      <w:r>
+        <w:br/>
+      </w:r>
+      <w:r>
+        <w:rPr>
+          <w:rStyle w:val="CommentTok"/>
+        </w:rPr>
+        <w:t xml:space="preserve"># Pairwise PERMANOVA</w:t>
+      </w:r>
+      <w:r>
+        <w:br/>
+      </w:r>
+      <w:r>
+        <w:rPr>
+          <w:rStyle w:val="FunctionTok"/>
+        </w:rPr>
+        <w:t xml:space="preserve">pairwise.perm.manova</w:t>
+      </w:r>
+      <w:r>
+        <w:rPr>
+          <w:rStyle w:val="NormalTok"/>
+        </w:rPr>
+        <w:t xml:space="preserve">(</w:t>
+      </w:r>
+      <w:r>
+        <w:rPr>
+          <w:rStyle w:val="FunctionTok"/>
+        </w:rPr>
+        <w:t xml:space="preserve">vegdist</w:t>
+      </w:r>
+      <w:r>
+        <w:rPr>
+          <w:rStyle w:val="NormalTok"/>
+        </w:rPr>
+        <w:t xml:space="preserve">(darl_scaled, </w:t>
+      </w:r>
+      <w:r>
+        <w:rPr>
+          <w:rStyle w:val="AttributeTok"/>
+        </w:rPr>
+        <w:t xml:space="preserve">method =</w:t>
+      </w:r>
+      <w:r>
+        <w:rPr>
+          <w:rStyle w:val="NormalTok"/>
+        </w:rPr>
+        <w:t xml:space="preserve"> </w:t>
+      </w:r>
+      <w:r>
+        <w:rPr>
+          <w:rStyle w:val="StringTok"/>
+        </w:rPr>
+        <w:t xml:space="preserve">"euclidean"</w:t>
+      </w:r>
+      <w:r>
+        <w:rPr>
+          <w:rStyle w:val="NormalTok"/>
+        </w:rPr>
+        <w:t xml:space="preserve">),</w:t>
+      </w:r>
+      <w:r>
+        <w:br/>
+      </w:r>
+      <w:r>
+        <w:rPr>
+          <w:rStyle w:val="NormalTok"/>
+        </w:rPr>
+        <w:t xml:space="preserve">                     darlingtonia</w:t>
+      </w:r>
+      <w:r>
+        <w:rPr>
+          <w:rStyle w:val="SpecialCharTok"/>
+        </w:rPr>
+        <w:t xml:space="preserve">$</w:t>
+      </w:r>
+      <w:r>
+        <w:rPr>
+          <w:rStyle w:val="NormalTok"/>
+        </w:rPr>
+        <w:t xml:space="preserve">site,</w:t>
+      </w:r>
+      <w:r>
+        <w:br/>
+      </w:r>
+      <w:r>
+        <w:rPr>
+          <w:rStyle w:val="NormalTok"/>
+        </w:rPr>
+        <w:t xml:space="preserve">                     </w:t>
+      </w:r>
+      <w:r>
+        <w:rPr>
+          <w:rStyle w:val="AttributeTok"/>
+        </w:rPr>
+        <w:t xml:space="preserve">test =</w:t>
+      </w:r>
+      <w:r>
+        <w:rPr>
+          <w:rStyle w:val="NormalTok"/>
+        </w:rPr>
+        <w:t xml:space="preserve"> </w:t>
+      </w:r>
+      <w:r>
+        <w:rPr>
+          <w:rStyle w:val="StringTok"/>
+        </w:rPr>
+        <w:t xml:space="preserve">"Wilks"</w:t>
+      </w:r>
+      <w:r>
+        <w:rPr>
+          <w:rStyle w:val="NormalTok"/>
+        </w:rPr>
+        <w:t xml:space="preserve">,</w:t>
+      </w:r>
+      <w:r>
+        <w:br/>
+      </w:r>
+      <w:r>
+        <w:rPr>
+          <w:rStyle w:val="NormalTok"/>
+        </w:rPr>
+        <w:t xml:space="preserve">                     </w:t>
+      </w:r>
+      <w:r>
+        <w:rPr>
+          <w:rStyle w:val="AttributeTok"/>
+        </w:rPr>
+        <w:t xml:space="preserve">nperm =</w:t>
+      </w:r>
+      <w:r>
+        <w:rPr>
+          <w:rStyle w:val="NormalTok"/>
+        </w:rPr>
+        <w:t xml:space="preserve"> </w:t>
+      </w:r>
+      <w:r>
+        <w:rPr>
+          <w:rStyle w:val="DecValTok"/>
+        </w:rPr>
+        <w:t xml:space="preserve">999</w:t>
+      </w:r>
+      <w:r>
+        <w:rPr>
+          <w:rStyle w:val="NormalTok"/>
+        </w:rPr>
+        <w:t xml:space="preserve">,</w:t>
+      </w:r>
+      <w:r>
+        <w:br/>
+      </w:r>
+      <w:r>
+        <w:rPr>
+          <w:rStyle w:val="NormalTok"/>
+        </w:rPr>
+        <w:t xml:space="preserve">                     </w:t>
+      </w:r>
+      <w:r>
+        <w:rPr>
+          <w:rStyle w:val="AttributeTok"/>
+        </w:rPr>
+        <w:t xml:space="preserve">p.method =</w:t>
+      </w:r>
+      <w:r>
+        <w:rPr>
+          <w:rStyle w:val="NormalTok"/>
+        </w:rPr>
+        <w:t xml:space="preserve"> </w:t>
+      </w:r>
+      <w:r>
+        <w:rPr>
+          <w:rStyle w:val="StringTok"/>
+        </w:rPr>
+        <w:t xml:space="preserve">"bonferroni"</w:t>
+      </w:r>
+      <w:r>
+        <w:rPr>
+          <w:rStyle w:val="NormalTok"/>
+        </w:rPr>
+        <w:t xml:space="preserve">)</w:t>
       </w:r>
       <w:r>
         <w:br/>
@@ -18681,7 +19034,7 @@
         <w:rPr>
           <w:rStyle w:val="DocumentationTok"/>
         </w:rPr>
-        <w:t xml:space="preserve">## Model     1   131.09 0.42382 25.745  0.001 ***</w:t>
+        <w:t xml:space="preserve">## </w:t>
       </w:r>
       <w:r>
         <w:br/>
@@ -18690,7 +19043,7 @@
         <w:rPr>
           <w:rStyle w:val="DocumentationTok"/>
         </w:rPr>
-        <w:t xml:space="preserve">## Residual 35   178.22 0.57618                  </w:t>
+        <w:t xml:space="preserve">##  Pairwise comparisons using permutation MANOVAs on a distance matrix </w:t>
       </w:r>
       <w:r>
         <w:br/>
@@ -18699,7 +19052,7 @@
         <w:rPr>
           <w:rStyle w:val="DocumentationTok"/>
         </w:rPr>
-        <w:t xml:space="preserve">## Total    36   309.31 1.00000                  </w:t>
+        <w:t xml:space="preserve">## </w:t>
       </w:r>
       <w:r>
         <w:br/>
@@ -18708,7 +19061,7 @@
         <w:rPr>
           <w:rStyle w:val="DocumentationTok"/>
         </w:rPr>
-        <w:t xml:space="preserve">## ---</w:t>
+        <w:t xml:space="preserve">## data:  vegdist(darl_scaled, method = "euclidean") by darlingtonia$site</w:t>
       </w:r>
       <w:r>
         <w:br/>
@@ -18717,7 +19070,7 @@
         <w:rPr>
           <w:rStyle w:val="DocumentationTok"/>
         </w:rPr>
-        <w:t xml:space="preserve">## Signif. codes:  0 '***' 0.001 '**' 0.01 '*' 0.05 '.' 0.1 ' ' 1</w:t>
+        <w:t xml:space="preserve">## 999 permutations </w:t>
       </w:r>
       <w:r>
         <w:br/>
@@ -18735,7 +19088,7 @@
         <w:rPr>
           <w:rStyle w:val="DocumentationTok"/>
         </w:rPr>
-        <w:t xml:space="preserve">## $LEH_vs_HD</w:t>
+        <w:t xml:space="preserve">##     DG    HD    LEH  </w:t>
       </w:r>
       <w:r>
         <w:br/>
@@ -18744,7 +19097,7 @@
         <w:rPr>
           <w:rStyle w:val="DocumentationTok"/>
         </w:rPr>
-        <w:t xml:space="preserve">##          Df SumOfSqs     R2      F Pr(&gt;F)    </w:t>
+        <w:t xml:space="preserve">## HD  0.006 -     -    </w:t>
       </w:r>
       <w:r>
         <w:br/>
@@ -18753,7 +19106,7 @@
         <w:rPr>
           <w:rStyle w:val="DocumentationTok"/>
         </w:rPr>
-        <w:t xml:space="preserve">## Model     1   101.69 0.2468 11.468  0.001 ***</w:t>
+        <w:t xml:space="preserve">## LEH 0.120 0.006 -    </w:t>
       </w:r>
       <w:r>
         <w:br/>
@@ -18762,360 +19115,7 @@
         <w:rPr>
           <w:rStyle w:val="DocumentationTok"/>
         </w:rPr>
-        <w:t xml:space="preserve">## Residual 35   310.35 0.7532                  </w:t>
-      </w:r>
-      <w:r>
-        <w:br/>
-      </w:r>
-      <w:r>
-        <w:rPr>
-          <w:rStyle w:val="DocumentationTok"/>
-        </w:rPr>
-        <w:t xml:space="preserve">## Total    36   412.04 1.0000                  </w:t>
-      </w:r>
-      <w:r>
-        <w:br/>
-      </w:r>
-      <w:r>
-        <w:rPr>
-          <w:rStyle w:val="DocumentationTok"/>
-        </w:rPr>
-        <w:t xml:space="preserve">## ---</w:t>
-      </w:r>
-      <w:r>
-        <w:br/>
-      </w:r>
-      <w:r>
-        <w:rPr>
-          <w:rStyle w:val="DocumentationTok"/>
-        </w:rPr>
-        <w:t xml:space="preserve">## Signif. codes:  0 '***' 0.001 '**' 0.01 '*' 0.05 '.' 0.1 ' ' 1</w:t>
-      </w:r>
-      <w:r>
-        <w:br/>
-      </w:r>
-      <w:r>
-        <w:rPr>
-          <w:rStyle w:val="DocumentationTok"/>
-        </w:rPr>
-        <w:t xml:space="preserve">## </w:t>
-      </w:r>
-      <w:r>
-        <w:br/>
-      </w:r>
-      <w:r>
-        <w:rPr>
-          <w:rStyle w:val="DocumentationTok"/>
-        </w:rPr>
-        <w:t xml:space="preserve">## attr(,"class")</w:t>
-      </w:r>
-      <w:r>
-        <w:br/>
-      </w:r>
-      <w:r>
-        <w:rPr>
-          <w:rStyle w:val="DocumentationTok"/>
-        </w:rPr>
-        <w:t xml:space="preserve">## [1] "pwadstrata" "list"</w:t>
-      </w:r>
-    </w:p>
-    <w:p>
-      <w:pPr>
-        <w:pStyle w:val="SourceCode"/>
-      </w:pPr>
-      <w:r>
-        <w:rPr>
-          <w:rStyle w:val="CommentTok"/>
-        </w:rPr>
-        <w:t xml:space="preserve"># install.packages("RVAideMemoire")</w:t>
-      </w:r>
-      <w:r>
-        <w:br/>
-      </w:r>
-      <w:r>
-        <w:rPr>
-          <w:rStyle w:val="FunctionTok"/>
-        </w:rPr>
-        <w:t xml:space="preserve">library</w:t>
-      </w:r>
-      <w:r>
-        <w:rPr>
-          <w:rStyle w:val="NormalTok"/>
-        </w:rPr>
-        <w:t xml:space="preserve">(RVAideMemoire)</w:t>
-      </w:r>
-      <w:r>
-        <w:br/>
-      </w:r>
-      <w:r>
-        <w:br/>
-      </w:r>
-      <w:r>
-        <w:rPr>
-          <w:rStyle w:val="CommentTok"/>
-        </w:rPr>
-        <w:t xml:space="preserve"># Pairwise PERMANOVA</w:t>
-      </w:r>
-      <w:r>
-        <w:br/>
-      </w:r>
-      <w:r>
-        <w:rPr>
-          <w:rStyle w:val="FunctionTok"/>
-        </w:rPr>
-        <w:t xml:space="preserve">pairwise.perm.manova</w:t>
-      </w:r>
-      <w:r>
-        <w:rPr>
-          <w:rStyle w:val="NormalTok"/>
-        </w:rPr>
-        <w:t xml:space="preserve">(</w:t>
-      </w:r>
-      <w:r>
-        <w:rPr>
-          <w:rStyle w:val="FunctionTok"/>
-        </w:rPr>
-        <w:t xml:space="preserve">vegdist</w:t>
-      </w:r>
-      <w:r>
-        <w:rPr>
-          <w:rStyle w:val="NormalTok"/>
-        </w:rPr>
-        <w:t xml:space="preserve">(darl_scaled, </w:t>
-      </w:r>
-      <w:r>
-        <w:rPr>
-          <w:rStyle w:val="AttributeTok"/>
-        </w:rPr>
-        <w:t xml:space="preserve">method =</w:t>
-      </w:r>
-      <w:r>
-        <w:rPr>
-          <w:rStyle w:val="NormalTok"/>
-        </w:rPr>
-        <w:t xml:space="preserve"> </w:t>
-      </w:r>
-      <w:r>
-        <w:rPr>
-          <w:rStyle w:val="StringTok"/>
-        </w:rPr>
-        <w:t xml:space="preserve">"euclidean"</w:t>
-      </w:r>
-      <w:r>
-        <w:rPr>
-          <w:rStyle w:val="NormalTok"/>
-        </w:rPr>
-        <w:t xml:space="preserve">),</w:t>
-      </w:r>
-      <w:r>
-        <w:br/>
-      </w:r>
-      <w:r>
-        <w:rPr>
-          <w:rStyle w:val="NormalTok"/>
-        </w:rPr>
-        <w:t xml:space="preserve">                     darlingtonia</w:t>
-      </w:r>
-      <w:r>
-        <w:rPr>
-          <w:rStyle w:val="SpecialCharTok"/>
-        </w:rPr>
-        <w:t xml:space="preserve">$</w:t>
-      </w:r>
-      <w:r>
-        <w:rPr>
-          <w:rStyle w:val="NormalTok"/>
-        </w:rPr>
-        <w:t xml:space="preserve">site,</w:t>
-      </w:r>
-      <w:r>
-        <w:br/>
-      </w:r>
-      <w:r>
-        <w:rPr>
-          <w:rStyle w:val="NormalTok"/>
-        </w:rPr>
-        <w:t xml:space="preserve">                     </w:t>
-      </w:r>
-      <w:r>
-        <w:rPr>
-          <w:rStyle w:val="AttributeTok"/>
-        </w:rPr>
-        <w:t xml:space="preserve">test =</w:t>
-      </w:r>
-      <w:r>
-        <w:rPr>
-          <w:rStyle w:val="NormalTok"/>
-        </w:rPr>
-        <w:t xml:space="preserve"> </w:t>
-      </w:r>
-      <w:r>
-        <w:rPr>
-          <w:rStyle w:val="StringTok"/>
-        </w:rPr>
-        <w:t xml:space="preserve">"Wilks"</w:t>
-      </w:r>
-      <w:r>
-        <w:rPr>
-          <w:rStyle w:val="NormalTok"/>
-        </w:rPr>
-        <w:t xml:space="preserve">,</w:t>
-      </w:r>
-      <w:r>
-        <w:br/>
-      </w:r>
-      <w:r>
-        <w:rPr>
-          <w:rStyle w:val="NormalTok"/>
-        </w:rPr>
-        <w:t xml:space="preserve">                     </w:t>
-      </w:r>
-      <w:r>
-        <w:rPr>
-          <w:rStyle w:val="AttributeTok"/>
-        </w:rPr>
-        <w:t xml:space="preserve">nperm =</w:t>
-      </w:r>
-      <w:r>
-        <w:rPr>
-          <w:rStyle w:val="NormalTok"/>
-        </w:rPr>
-        <w:t xml:space="preserve"> </w:t>
-      </w:r>
-      <w:r>
-        <w:rPr>
-          <w:rStyle w:val="DecValTok"/>
-        </w:rPr>
-        <w:t xml:space="preserve">999</w:t>
-      </w:r>
-      <w:r>
-        <w:rPr>
-          <w:rStyle w:val="NormalTok"/>
-        </w:rPr>
-        <w:t xml:space="preserve">,</w:t>
-      </w:r>
-      <w:r>
-        <w:br/>
-      </w:r>
-      <w:r>
-        <w:rPr>
-          <w:rStyle w:val="NormalTok"/>
-        </w:rPr>
-        <w:t xml:space="preserve">                     </w:t>
-      </w:r>
-      <w:r>
-        <w:rPr>
-          <w:rStyle w:val="AttributeTok"/>
-        </w:rPr>
-        <w:t xml:space="preserve">p.method =</w:t>
-      </w:r>
-      <w:r>
-        <w:rPr>
-          <w:rStyle w:val="NormalTok"/>
-        </w:rPr>
-        <w:t xml:space="preserve"> </w:t>
-      </w:r>
-      <w:r>
-        <w:rPr>
-          <w:rStyle w:val="StringTok"/>
-        </w:rPr>
-        <w:t xml:space="preserve">"bonferroni"</w:t>
-      </w:r>
-      <w:r>
-        <w:rPr>
-          <w:rStyle w:val="NormalTok"/>
-        </w:rPr>
-        <w:t xml:space="preserve">)</w:t>
-      </w:r>
-      <w:r>
-        <w:br/>
-      </w:r>
-      <w:r>
-        <w:rPr>
-          <w:rStyle w:val="DocumentationTok"/>
-        </w:rPr>
-        <w:t xml:space="preserve">## </w:t>
-      </w:r>
-      <w:r>
-        <w:br/>
-      </w:r>
-      <w:r>
-        <w:rPr>
-          <w:rStyle w:val="DocumentationTok"/>
-        </w:rPr>
-        <w:t xml:space="preserve">##  Pairwise comparisons using permutation MANOVAs on a distance matrix </w:t>
-      </w:r>
-      <w:r>
-        <w:br/>
-      </w:r>
-      <w:r>
-        <w:rPr>
-          <w:rStyle w:val="DocumentationTok"/>
-        </w:rPr>
-        <w:t xml:space="preserve">## </w:t>
-      </w:r>
-      <w:r>
-        <w:br/>
-      </w:r>
-      <w:r>
-        <w:rPr>
-          <w:rStyle w:val="DocumentationTok"/>
-        </w:rPr>
-        <w:t xml:space="preserve">## data:  vegdist(darl_scaled, method = "euclidean") by darlingtonia$site</w:t>
-      </w:r>
-      <w:r>
-        <w:br/>
-      </w:r>
-      <w:r>
-        <w:rPr>
-          <w:rStyle w:val="DocumentationTok"/>
-        </w:rPr>
-        <w:t xml:space="preserve">## 999 permutations </w:t>
-      </w:r>
-      <w:r>
-        <w:br/>
-      </w:r>
-      <w:r>
-        <w:rPr>
-          <w:rStyle w:val="DocumentationTok"/>
-        </w:rPr>
-        <w:t xml:space="preserve">## </w:t>
-      </w:r>
-      <w:r>
-        <w:br/>
-      </w:r>
-      <w:r>
-        <w:rPr>
-          <w:rStyle w:val="DocumentationTok"/>
-        </w:rPr>
-        <w:t xml:space="preserve">##     DG    HD    LEH  </w:t>
-      </w:r>
-      <w:r>
-        <w:br/>
-      </w:r>
-      <w:r>
-        <w:rPr>
-          <w:rStyle w:val="DocumentationTok"/>
-        </w:rPr>
-        <w:t xml:space="preserve">## HD  0.006 -     -    </w:t>
-      </w:r>
-      <w:r>
-        <w:br/>
-      </w:r>
-      <w:r>
-        <w:rPr>
-          <w:rStyle w:val="DocumentationTok"/>
-        </w:rPr>
-        <w:t xml:space="preserve">## LEH 0.096 0.006 -    </w:t>
-      </w:r>
-      <w:r>
-        <w:br/>
-      </w:r>
-      <w:r>
-        <w:rPr>
-          <w:rStyle w:val="DocumentationTok"/>
-        </w:rPr>
-        <w:t xml:space="preserve">## TJH 0.006 0.006 0.006</w:t>
+        <w:t xml:space="preserve">## TJH 0.018 0.006 0.024</w:t>
       </w:r>
       <w:r>
         <w:br/>

</xml_diff>